<commit_message>
Add: json file with address offset information
</commit_message>
<xml_diff>
--- a/docs/PoC_Custom_Setup_issue_1.docx
+++ b/docs/PoC_Custom_Setup_issue_1.docx
@@ -577,7 +577,169 @@
       <w:r>
         <w:t>[Konstantin-FZ-issue-1.zip](https://github.com/user-attachments/files/17922775/Konstantin-FZ-issue-1.zip)</w:t>
       </w:r>
+      <w:r>
+        <w:br/>
+      </w:r>
+      <w:r>
+        <w:br/>
+      </w:r>
     </w:p>
+    <w:p/>
+    <w:p/>
+    <w:p/>
+    <w:p/>
+    <w:p/>
+    <w:p/>
+    <w:p>
+      <w:pPr>
+        <w:pStyle w:val="Heading2"/>
+      </w:pPr>
+      <w:r>
+        <w:lastRenderedPageBreak/>
+        <w:t>Flashing Binaries</w:t>
+      </w:r>
+    </w:p>
+    <w:p>
+      <w:r>
+        <w:br/>
+        <w:t>Binaries can be extracted from Binaries.zip provided</w:t>
+      </w:r>
+      <w:r>
+        <w:t xml:space="preserve"> and addresses can be verified from flasher_args.json file if required</w:t>
+      </w:r>
+      <w:r>
+        <w:br/>
+      </w:r>
+    </w:p>
+    <w:p>
+      <w:r>
+        <w:rPr>
+          <w:b/>
+          <w:bCs/>
+        </w:rPr>
+        <w:t>BIN FILE</w:t>
+      </w:r>
+      <w:r>
+        <w:rPr>
+          <w:b/>
+          <w:bCs/>
+        </w:rPr>
+        <w:tab/>
+      </w:r>
+      <w:r>
+        <w:tab/>
+      </w:r>
+      <w:r>
+        <w:tab/>
+      </w:r>
+      <w:r>
+        <w:tab/>
+      </w:r>
+      <w:r>
+        <w:tab/>
+      </w:r>
+      <w:r>
+        <w:tab/>
+      </w:r>
+      <w:r>
+        <w:rPr>
+          <w:b/>
+          <w:bCs/>
+        </w:rPr>
+        <w:t>ADDRESS OFFSET</w:t>
+      </w:r>
+      <w:r>
+        <w:br/>
+        <w:t>bootloader.bin</w:t>
+      </w:r>
+      <w:r>
+        <w:tab/>
+      </w:r>
+      <w:r>
+        <w:tab/>
+      </w:r>
+      <w:r>
+        <w:tab/>
+      </w:r>
+      <w:r>
+        <w:tab/>
+      </w:r>
+      <w:r>
+        <w:tab/>
+      </w:r>
+      <w:r>
+        <w:tab/>
+        <w:t>0x0</w:t>
+      </w:r>
+    </w:p>
+    <w:p>
+      <w:r>
+        <w:t>test-skainet.bin</w:t>
+      </w:r>
+      <w:r>
+        <w:tab/>
+      </w:r>
+      <w:r>
+        <w:tab/>
+      </w:r>
+      <w:r>
+        <w:tab/>
+      </w:r>
+      <w:r>
+        <w:tab/>
+      </w:r>
+      <w:r>
+        <w:tab/>
+        <w:t>0x10000</w:t>
+      </w:r>
+    </w:p>
+    <w:p>
+      <w:r>
+        <w:t>partition-table.bin</w:t>
+      </w:r>
+      <w:r>
+        <w:tab/>
+      </w:r>
+      <w:r>
+        <w:tab/>
+      </w:r>
+      <w:r>
+        <w:tab/>
+      </w:r>
+      <w:r>
+        <w:tab/>
+      </w:r>
+      <w:r>
+        <w:tab/>
+        <w:t>0x8000</w:t>
+      </w:r>
+    </w:p>
+    <w:p>
+      <w:r>
+        <w:t>srmodels.bin</w:t>
+      </w:r>
+      <w:r>
+        <w:tab/>
+      </w:r>
+      <w:r>
+        <w:tab/>
+      </w:r>
+      <w:r>
+        <w:tab/>
+      </w:r>
+      <w:r>
+        <w:tab/>
+      </w:r>
+      <w:r>
+        <w:tab/>
+      </w:r>
+      <w:r>
+        <w:tab/>
+        <w:t>0x281000</w:t>
+      </w:r>
+    </w:p>
+    <w:p/>
+    <w:p/>
     <w:sectPr>
       <w:pgSz w:w="12240" w:h="15840"/>
       <w:pgMar w:top="1440" w:right="1800" w:bottom="1440" w:left="1800" w:header="720" w:footer="720" w:gutter="0"/>

</xml_diff>